<commit_message>
Release Alpicois sync and admin workflows
</commit_message>
<xml_diff>
--- a/backend/templates/contrat.docx
+++ b/backend/templates/contrat.docx
@@ -350,7 +350,6 @@
                 <w:rFonts w:ascii="Arial" w:hAnsi="Arial" w:cs="Arial"/>
                 <w:sz w:val="21"/>
                 <w:szCs w:val="21"/>
-                <w:highlight w:val="yellow"/>
               </w:rPr>
               <w:t>{contractSuffix}</w:t>
             </w:r>
@@ -437,7 +436,6 @@
                 <w:rFonts w:ascii="Arial" w:hAnsi="Arial" w:cs="Arial"/>
                 <w:sz w:val="21"/>
                 <w:szCs w:val="21"/>
-                <w:highlight w:val="yellow"/>
               </w:rPr>
               <w:t>{contractDate}</w:t>
             </w:r>
@@ -1026,9 +1024,7 @@
           </w:tcPr>
           <w:p>
             <w:r>
-              <w:rPr>
-                <w:highlight w:val="yellow"/>
-              </w:rPr>
+              <w:rPr/>
               <w:t>{tenantName}</w:t>
             </w:r>
           </w:p>
@@ -1085,25 +1081,19 @@
           </w:tcPr>
           <w:p>
             <w:r>
-              <w:rPr>
-                <w:highlight w:val="yellow"/>
-              </w:rPr>
+              <w:rPr/>
               <w:t>{tenantAddress1}</w:t>
             </w:r>
           </w:p>
           <w:p>
             <w:r>
-              <w:rPr>
-                <w:highlight w:val="yellow"/>
-              </w:rPr>
+              <w:rPr/>
               <w:t>{tenantAddress2}</w:t>
             </w:r>
           </w:p>
           <w:p>
             <w:r>
-              <w:rPr>
-                <w:highlight w:val="yellow"/>
-              </w:rPr>
+              <w:rPr/>
               <w:t>{tenantAddress3}</w:t>
             </w:r>
           </w:p>
@@ -1160,9 +1150,7 @@
           </w:tcPr>
           <w:p>
             <w:r>
-              <w:rPr>
-                <w:highlight w:val="yellow"/>
-              </w:rPr>
+              <w:rPr/>
               <w:t>{tenantPhone}</w:t>
             </w:r>
           </w:p>
@@ -1221,9 +1209,7 @@
           </w:tcPr>
           <w:p>
             <w:r>
-              <w:rPr>
-                <w:highlight w:val="yellow"/>
-              </w:rPr>
+              <w:rPr/>
               <w:t>{tenantEmail}</w:t>
             </w:r>
           </w:p>
@@ -1280,9 +1266,7 @@
           </w:tcPr>
           <w:p>
             <w:r>
-              <w:rPr>
-                <w:highlight w:val="yellow"/>
-              </w:rPr>
+              <w:rPr/>
               <w:t>{adults}</w:t>
             </w:r>
           </w:p>
@@ -1339,9 +1323,7 @@
           </w:tcPr>
           <w:p>
             <w:r>
-              <w:rPr>
-                <w:highlight w:val="yellow"/>
-              </w:rPr>
+              <w:rPr/>
               <w:t>{children}</w:t>
             </w:r>
           </w:p>
@@ -2914,24 +2896,22 @@
                 <w:rFonts w:ascii="Arial" w:hAnsi="Arial" w:cs="Arial"/>
                 <w:sz w:val="21"/>
                 <w:szCs w:val="21"/>
-                <w:highlight w:val="yellow"/>
-              </w:rPr>
-            </w:pPr>
-          </w:p>
-          <w:p>
-            <w:pPr>
-              <w:rPr>
-                <w:rFonts w:ascii="Arial" w:hAnsi="Arial" w:cs="Arial"/>
-                <w:sz w:val="21"/>
-                <w:szCs w:val="21"/>
-              </w:rPr>
-            </w:pPr>
-            <w:r>
-              <w:rPr>
-                <w:rFonts w:ascii="Arial" w:hAnsi="Arial" w:cs="Arial"/>
-                <w:sz w:val="21"/>
-                <w:szCs w:val="21"/>
-                <w:highlight w:val="yellow"/>
+              </w:rPr>
+            </w:pPr>
+          </w:p>
+          <w:p>
+            <w:pPr>
+              <w:rPr>
+                <w:rFonts w:ascii="Arial" w:hAnsi="Arial" w:cs="Arial"/>
+                <w:sz w:val="21"/>
+                <w:szCs w:val="21"/>
+              </w:rPr>
+            </w:pPr>
+            <w:r>
+              <w:rPr>
+                <w:rFonts w:ascii="Arial" w:hAnsi="Arial" w:cs="Arial"/>
+                <w:sz w:val="21"/>
+                <w:szCs w:val="21"/>
               </w:rPr>
               <w:t>{weeklyRent}</w:t>
             </w:r>
@@ -3187,7 +3167,6 @@
                 <w:rFonts w:ascii="Arial" w:hAnsi="Arial" w:cs="Arial"/>
                 <w:sz w:val="21"/>
                 <w:szCs w:val="21"/>
-                <w:highlight w:val="yellow"/>
               </w:rPr>
               <w:t>{taxAdults}</w:t>
             </w:r>
@@ -3205,7 +3184,6 @@
                 <w:rFonts w:ascii="Arial" w:hAnsi="Arial" w:cs="Arial"/>
                 <w:sz w:val="21"/>
                 <w:szCs w:val="21"/>
-                <w:highlight w:val="yellow"/>
               </w:rPr>
               <w:t>{touristTaxTotal}</w:t>
             </w:r>
@@ -3314,24 +3292,22 @@
                 <w:rFonts w:ascii="Arial" w:hAnsi="Arial" w:cs="Arial"/>
                 <w:sz w:val="21"/>
                 <w:szCs w:val="21"/>
-                <w:highlight w:val="yellow"/>
-              </w:rPr>
-            </w:pPr>
-          </w:p>
-          <w:p>
-            <w:pPr>
-              <w:rPr>
-                <w:rFonts w:ascii="Arial" w:hAnsi="Arial" w:cs="Arial"/>
-                <w:sz w:val="21"/>
-                <w:szCs w:val="21"/>
-              </w:rPr>
-            </w:pPr>
-            <w:r>
-              <w:rPr>
-                <w:rFonts w:ascii="Arial" w:hAnsi="Arial" w:cs="Arial"/>
-                <w:sz w:val="21"/>
-                <w:szCs w:val="21"/>
-                <w:highlight w:val="yellow"/>
+              </w:rPr>
+            </w:pPr>
+          </w:p>
+          <w:p>
+            <w:pPr>
+              <w:rPr>
+                <w:rFonts w:ascii="Arial" w:hAnsi="Arial" w:cs="Arial"/>
+                <w:sz w:val="21"/>
+                <w:szCs w:val="21"/>
+              </w:rPr>
+            </w:pPr>
+            <w:r>
+              <w:rPr>
+                <w:rFonts w:ascii="Arial" w:hAnsi="Arial" w:cs="Arial"/>
+                <w:sz w:val="21"/>
+                <w:szCs w:val="21"/>
               </w:rPr>
               <w:t>{totalDue}</w:t>
             </w:r>
@@ -3541,7 +3517,6 @@
                 <w:rFonts w:ascii="Arial" w:hAnsi="Arial" w:cs="Arial"/>
                 <w:sz w:val="21"/>
                 <w:szCs w:val="21"/>
-                <w:highlight w:val="yellow"/>
               </w:rPr>
               <w:t>{deposit30}</w:t>
             </w:r>
@@ -3710,7 +3685,6 @@
                 <w:rFonts w:ascii="Arial" w:hAnsi="Arial" w:cs="Arial"/>
                 <w:sz w:val="21"/>
                 <w:szCs w:val="21"/>
-                <w:highlight w:val="yellow"/>
               </w:rPr>
               <w:t>{balance70}</w:t>
             </w:r>
@@ -6197,7 +6171,6 @@
                 <w:rFonts w:ascii="Arial" w:hAnsi="Arial" w:cs="Arial"/>
                 <w:sz w:val="21"/>
                 <w:szCs w:val="21"/>
-                <w:highlight w:val="yellow"/>
               </w:rPr>
               <w:t>{tenantSignatureName}</w:t>
             </w:r>

</xml_diff>